<commit_message>
Document exact E2 prompts across README, run guide, and report.
Point reviewers to ACTUAL_PROMPTS_E2.md and sample_rendered JSON files for the messages sent to the LLM.

Co-authored-by: Cursor <cursoragent@cursor.com>
</commit_message>
<xml_diff>
--- a/demo/HOW_TO_PRESENT_DEMO.docx
+++ b/demo/HOW_TO_PRESENT_DEMO.docx
@@ -1049,6 +1049,58 @@
       </w:pPr>
       <w:r>
         <w:rPr>
+          <w:rFonts w:ascii="Calibri" w:hAnsi="Calibri" w:eastAsia="Calibri"/>
+          <w:b w:val="0"/>
+          <w:i w:val="0"/>
+          <w:sz w:val="22"/>
+        </w:rPr>
+        <w:t xml:space="preserve">Optional: </w:t>
+      </w:r>
+      <w:r>
+        <w:rPr>
+          <w:rFonts w:ascii="Consolas" w:hAnsi="Consolas" w:eastAsia="Consolas"/>
+          <w:b w:val="0"/>
+          <w:i w:val="0"/>
+          <w:color w:val="333333"/>
+          <w:sz w:val="20"/>
+        </w:rPr>
+        <w:t>prompts/ACTUAL_PROMPTS_E2.md</w:t>
+      </w:r>
+      <w:r>
+        <w:rPr>
+          <w:rFonts w:ascii="Calibri" w:hAnsi="Calibri" w:eastAsia="Calibri"/>
+          <w:b w:val="0"/>
+          <w:i w:val="0"/>
+          <w:sz w:val="22"/>
+        </w:rPr>
+        <w:t xml:space="preserve"> or one </w:t>
+      </w:r>
+      <w:r>
+        <w:rPr>
+          <w:rFonts w:ascii="Consolas" w:hAnsi="Consolas" w:eastAsia="Consolas"/>
+          <w:b w:val="0"/>
+          <w:i w:val="0"/>
+          <w:color w:val="333333"/>
+          <w:sz w:val="20"/>
+        </w:rPr>
+        <w:t>prompts/sample_rendered_*.json</w:t>
+      </w:r>
+      <w:r>
+        <w:rPr>
+          <w:rFonts w:ascii="Calibri" w:hAnsi="Calibri" w:eastAsia="Calibri"/>
+          <w:b w:val="0"/>
+          <w:i w:val="0"/>
+          <w:sz w:val="22"/>
+        </w:rPr>
+        <w:t xml:space="preserve"> — show the exact Task line / few-shot block</w:t>
+      </w:r>
+    </w:p>
+    <w:p>
+      <w:pPr>
+        <w:pStyle w:val="ListNumber"/>
+      </w:pPr>
+      <w:r>
+        <w:rPr>
           <w:rFonts w:ascii="Consolas" w:hAnsi="Consolas" w:eastAsia="Consolas"/>
           <w:b w:val="0"/>
           <w:i w:val="0"/>

</xml_diff>

<commit_message>
Add Group 15 demo video Google Drive link.
Co-authored-by: Cursor <cursoragent@cursor.com>
</commit_message>
<xml_diff>
--- a/demo/HOW_TO_PRESENT_DEMO.docx
+++ b/demo/HOW_TO_PRESENT_DEMO.docx
@@ -13,69 +13,38 @@
     <w:p>
       <w:r>
         <w:rPr>
-          <w:rFonts w:ascii="Calibri" w:hAnsi="Calibri" w:eastAsia="Calibri"/>
           <w:b/>
-          <w:i w:val="0"/>
-          <w:sz w:val="22"/>
         </w:rPr>
         <w:t>Project:</w:t>
       </w:r>
       <w:r>
-        <w:rPr>
-          <w:rFonts w:ascii="Calibri" w:hAnsi="Calibri" w:eastAsia="Calibri"/>
-          <w:b w:val="0"/>
-          <w:i w:val="0"/>
-          <w:sz w:val="22"/>
-        </w:rPr>
         <w:t xml:space="preserve"> BANKING77 banking assistant</w:t>
       </w:r>
     </w:p>
     <w:p>
       <w:r>
         <w:rPr>
-          <w:rFonts w:ascii="Calibri" w:hAnsi="Calibri" w:eastAsia="Calibri"/>
           <w:b/>
-          <w:i w:val="0"/>
-          <w:sz w:val="22"/>
         </w:rPr>
         <w:t>Target length:</w:t>
       </w:r>
       <w:r>
-        <w:rPr>
-          <w:rFonts w:ascii="Calibri" w:hAnsi="Calibri" w:eastAsia="Calibri"/>
-          <w:b w:val="0"/>
-          <w:i w:val="0"/>
-          <w:sz w:val="22"/>
-        </w:rPr>
         <w:t xml:space="preserve"> 8–10 minutes</w:t>
       </w:r>
     </w:p>
     <w:p>
       <w:r>
         <w:rPr>
-          <w:rFonts w:ascii="Calibri" w:hAnsi="Calibri" w:eastAsia="Calibri"/>
           <w:b/>
-          <w:i w:val="0"/>
-          <w:sz w:val="22"/>
         </w:rPr>
         <w:t>Speaking lines:</w:t>
       </w:r>
       <w:r>
-        <w:rPr>
-          <w:rFonts w:ascii="Calibri" w:hAnsi="Calibri" w:eastAsia="Calibri"/>
-          <w:b w:val="0"/>
-          <w:i w:val="0"/>
-          <w:sz w:val="22"/>
-        </w:rPr>
         <w:t xml:space="preserve"> </w:t>
       </w:r>
       <w:r>
         <w:rPr>
-          <w:rFonts w:ascii="Consolas" w:hAnsi="Consolas" w:eastAsia="Consolas"/>
-          <w:b w:val="0"/>
-          <w:i w:val="0"/>
-          <w:color w:val="333333"/>
-          <w:sz w:val="20"/>
+          <w:rFonts w:ascii="Consolas" w:hAnsi="Consolas"/>
         </w:rPr>
         <w:t>Group15_Demo_Speaking_Script.docx</w:t>
       </w:r>
@@ -83,21 +52,42 @@
     <w:p>
       <w:r>
         <w:rPr>
-          <w:rFonts w:ascii="Calibri" w:hAnsi="Calibri" w:eastAsia="Calibri"/>
           <w:b/>
-          <w:i w:val="0"/>
-          <w:sz w:val="22"/>
         </w:rPr>
         <w:t>Repo:</w:t>
       </w:r>
       <w:r>
+        <w:t xml:space="preserve"> https://github.com/bits-pgaiml-agai/pcam-zg516-a1-banking77</w:t>
+      </w:r>
+    </w:p>
+    <w:p>
+      <w:r>
         <w:rPr>
-          <w:rFonts w:ascii="Calibri" w:hAnsi="Calibri" w:eastAsia="Calibri"/>
-          <w:b w:val="0"/>
-          <w:i w:val="0"/>
-          <w:sz w:val="22"/>
+          <w:b/>
         </w:rPr>
-        <w:t xml:space="preserve"> https://github.com/bits-pgaiml-agai/pcam-zg516-a1-banking77</w:t>
+        <w:t>Recorded video (Google Drive):</w:t>
+      </w:r>
+      <w:r>
+        <w:t xml:space="preserve"> https://drive.google.com/file/d/1Dohvy0xKWXzJqEOCO_tHSFkhXZA9JHUY/view?usp=drive_link</w:t>
+      </w:r>
+    </w:p>
+    <w:p>
+      <w:r>
+        <w:t xml:space="preserve">(also in </w:t>
+      </w:r>
+      <w:r>
+        <w:rPr>
+          <w:rFonts w:ascii="Consolas" w:hAnsi="Consolas"/>
+        </w:rPr>
+        <w:t>demo/VIDEO_LINK.txt</w:t>
+      </w:r>
+      <w:r>
+        <w:t>)</w:t>
+      </w:r>
+    </w:p>
+    <w:p>
+      <w:r>
+        <w:t>────────────────────────────────────────</w:t>
       </w:r>
     </w:p>
     <w:p>
@@ -110,48 +100,24 @@
     </w:p>
     <w:p>
       <w:r>
-        <w:rPr>
-          <w:rFonts w:ascii="Calibri" w:hAnsi="Calibri" w:eastAsia="Calibri"/>
-          <w:b w:val="0"/>
-          <w:i w:val="0"/>
-          <w:sz w:val="22"/>
-        </w:rPr>
         <w:t xml:space="preserve">Use </w:t>
       </w:r>
       <w:r>
         <w:rPr>
-          <w:rFonts w:ascii="Calibri" w:hAnsi="Calibri" w:eastAsia="Calibri"/>
           <w:b/>
-          <w:i w:val="0"/>
-          <w:sz w:val="22"/>
         </w:rPr>
         <w:t>Google Colab</w:t>
       </w:r>
       <w:r>
-        <w:rPr>
-          <w:rFonts w:ascii="Calibri" w:hAnsi="Calibri" w:eastAsia="Calibri"/>
-          <w:b w:val="0"/>
-          <w:i w:val="0"/>
-          <w:sz w:val="22"/>
-        </w:rPr>
         <w:t xml:space="preserve"> for a short live run (E1 + tool), and show </w:t>
       </w:r>
       <w:r>
         <w:rPr>
-          <w:rFonts w:ascii="Calibri" w:hAnsi="Calibri" w:eastAsia="Calibri"/>
           <w:b/>
-          <w:i w:val="0"/>
-          <w:sz w:val="22"/>
         </w:rPr>
         <w:t>committed evidence</w:t>
       </w:r>
       <w:r>
-        <w:rPr>
-          <w:rFonts w:ascii="Calibri" w:hAnsi="Calibri" w:eastAsia="Calibri"/>
-          <w:b w:val="0"/>
-          <w:i w:val="0"/>
-          <w:sz w:val="22"/>
-        </w:rPr>
         <w:t xml:space="preserve"> for E2–E5 results. That is the most reliable demo.</w:t>
       </w:r>
     </w:p>
@@ -162,58 +128,37 @@
         <w:tblLook w:firstColumn="1" w:firstRow="1" w:lastColumn="0" w:lastRow="0" w:noHBand="0" w:noVBand="1" w:val="04A0"/>
       </w:tblPr>
       <w:tblGrid>
-        <w:gridCol w:w="3120"/>
-        <w:gridCol w:w="3120"/>
-        <w:gridCol w:w="3120"/>
+        <w:gridCol w:w="2880"/>
+        <w:gridCol w:w="2880"/>
+        <w:gridCol w:w="2880"/>
       </w:tblGrid>
       <w:tr>
         <w:tc>
           <w:tcPr>
-            <w:tcW w:type="dxa" w:w="3120"/>
+            <w:tcW w:type="dxa" w:w="2880"/>
           </w:tcPr>
           <w:p>
-            <w:r/>
             <w:r>
-              <w:rPr>
-                <w:rFonts w:ascii="Calibri" w:hAnsi="Calibri" w:eastAsia="Calibri"/>
-                <w:b/>
-                <w:i w:val="0"/>
-                <w:sz w:val="20"/>
-              </w:rPr>
               <w:t>Mode</w:t>
             </w:r>
           </w:p>
         </w:tc>
         <w:tc>
           <w:tcPr>
-            <w:tcW w:type="dxa" w:w="3120"/>
+            <w:tcW w:type="dxa" w:w="2880"/>
           </w:tcPr>
           <w:p>
-            <w:r/>
             <w:r>
-              <w:rPr>
-                <w:rFonts w:ascii="Calibri" w:hAnsi="Calibri" w:eastAsia="Calibri"/>
-                <w:b/>
-                <w:i w:val="0"/>
-                <w:sz w:val="20"/>
-              </w:rPr>
               <w:t>Use for</w:t>
             </w:r>
           </w:p>
         </w:tc>
         <w:tc>
           <w:tcPr>
-            <w:tcW w:type="dxa" w:w="3120"/>
+            <w:tcW w:type="dxa" w:w="2880"/>
           </w:tcPr>
           <w:p>
-            <w:r/>
             <w:r>
-              <w:rPr>
-                <w:rFonts w:ascii="Calibri" w:hAnsi="Calibri" w:eastAsia="Calibri"/>
-                <w:b/>
-                <w:i w:val="0"/>
-                <w:sz w:val="20"/>
-              </w:rPr>
               <w:t>Risk</w:t>
             </w:r>
           </w:p>
@@ -222,79 +167,30 @@
       <w:tr>
         <w:tc>
           <w:tcPr>
-            <w:tcW w:type="dxa" w:w="3120"/>
+            <w:tcW w:type="dxa" w:w="2880"/>
           </w:tcPr>
           <w:p>
-            <w:r/>
             <w:r>
-              <w:rPr>
-                <w:rFonts w:ascii="Calibri" w:hAnsi="Calibri" w:eastAsia="Calibri"/>
-                <w:b/>
-                <w:i w:val="0"/>
-                <w:sz w:val="20"/>
-              </w:rPr>
-              <w:t>Colab T4</w:t>
-            </w:r>
-            <w:r>
-              <w:rPr>
-                <w:rFonts w:ascii="Calibri" w:hAnsi="Calibri" w:eastAsia="Calibri"/>
-                <w:b w:val="0"/>
-                <w:i w:val="0"/>
-                <w:sz w:val="20"/>
-              </w:rPr>
-              <w:t xml:space="preserve"> (preferred live)</w:t>
+              <w:t>**Colab T4** (preferred live)</w:t>
             </w:r>
           </w:p>
         </w:tc>
         <w:tc>
           <w:tcPr>
-            <w:tcW w:type="dxa" w:w="3120"/>
+            <w:tcW w:type="dxa" w:w="2880"/>
           </w:tcPr>
           <w:p>
-            <w:r/>
             <w:r>
-              <w:rPr>
-                <w:rFonts w:ascii="Calibri" w:hAnsi="Calibri" w:eastAsia="Calibri"/>
-                <w:b w:val="0"/>
-                <w:i w:val="0"/>
-                <w:sz w:val="20"/>
-              </w:rPr>
-              <w:t xml:space="preserve">Notebook open, E1 cells, </w:t>
-            </w:r>
-            <w:r>
-              <w:rPr>
-                <w:rFonts w:ascii="Consolas" w:hAnsi="Consolas" w:eastAsia="Consolas"/>
-                <w:b w:val="0"/>
-                <w:i w:val="0"/>
-                <w:color w:val="333333"/>
-                <w:sz w:val="20"/>
-              </w:rPr>
-              <w:t>dispatch_tool</w:t>
-            </w:r>
-            <w:r>
-              <w:rPr>
-                <w:rFonts w:ascii="Calibri" w:hAnsi="Calibri" w:eastAsia="Calibri"/>
-                <w:b w:val="0"/>
-                <w:i w:val="0"/>
-                <w:sz w:val="20"/>
-              </w:rPr>
-              <w:t xml:space="preserve"> live</w:t>
+              <w:t>Notebook open, E1 cells, `dispatch_tool` live</w:t>
             </w:r>
           </w:p>
         </w:tc>
         <w:tc>
           <w:tcPr>
-            <w:tcW w:type="dxa" w:w="3120"/>
+            <w:tcW w:type="dxa" w:w="2880"/>
           </w:tcPr>
           <w:p>
-            <w:r/>
             <w:r>
-              <w:rPr>
-                <w:rFonts w:ascii="Calibri" w:hAnsi="Calibri" w:eastAsia="Calibri"/>
-                <w:b w:val="0"/>
-                <w:i w:val="0"/>
-                <w:sz w:val="20"/>
-              </w:rPr>
               <w:t>HF download / queue can be slow</w:t>
             </w:r>
           </w:p>
@@ -303,60 +199,30 @@
       <w:tr>
         <w:tc>
           <w:tcPr>
-            <w:tcW w:type="dxa" w:w="3120"/>
+            <w:tcW w:type="dxa" w:w="2880"/>
           </w:tcPr>
           <w:p>
-            <w:r/>
             <w:r>
-              <w:rPr>
-                <w:rFonts w:ascii="Calibri" w:hAnsi="Calibri" w:eastAsia="Calibri"/>
-                <w:b/>
-                <w:i w:val="0"/>
-                <w:sz w:val="20"/>
-              </w:rPr>
-              <w:t>Committed evidence</w:t>
-            </w:r>
-            <w:r>
-              <w:rPr>
-                <w:rFonts w:ascii="Calibri" w:hAnsi="Calibri" w:eastAsia="Calibri"/>
-                <w:b w:val="0"/>
-                <w:i w:val="0"/>
-                <w:sz w:val="20"/>
-              </w:rPr>
-              <w:t xml:space="preserve"> (always ready)</w:t>
+              <w:t>**Committed evidence** (always ready)</w:t>
             </w:r>
           </w:p>
         </w:tc>
         <w:tc>
           <w:tcPr>
-            <w:tcW w:type="dxa" w:w="3120"/>
+            <w:tcW w:type="dxa" w:w="2880"/>
           </w:tcPr>
           <w:p>
-            <w:r/>
             <w:r>
-              <w:rPr>
-                <w:rFonts w:ascii="Calibri" w:hAnsi="Calibri" w:eastAsia="Calibri"/>
-                <w:b w:val="0"/>
-                <w:i w:val="0"/>
-                <w:sz w:val="20"/>
-              </w:rPr>
               <w:t>E2/E3 tables, E4 10/10, E5 tool CSV, E6 failures</w:t>
             </w:r>
           </w:p>
         </w:tc>
         <w:tc>
           <w:tcPr>
-            <w:tcW w:type="dxa" w:w="3120"/>
+            <w:tcW w:type="dxa" w:w="2880"/>
           </w:tcPr>
           <w:p>
-            <w:r/>
             <w:r>
-              <w:rPr>
-                <w:rFonts w:ascii="Calibri" w:hAnsi="Calibri" w:eastAsia="Calibri"/>
-                <w:b w:val="0"/>
-                <w:i w:val="0"/>
-                <w:sz w:val="20"/>
-              </w:rPr>
               <w:t>None — already in repo</w:t>
             </w:r>
           </w:p>
@@ -365,123 +231,71 @@
       <w:tr>
         <w:tc>
           <w:tcPr>
-            <w:tcW w:type="dxa" w:w="3120"/>
+            <w:tcW w:type="dxa" w:w="2880"/>
           </w:tcPr>
           <w:p>
-            <w:r/>
             <w:r>
-              <w:rPr>
-                <w:rFonts w:ascii="Calibri" w:hAnsi="Calibri" w:eastAsia="Calibri"/>
-                <w:b/>
-                <w:i w:val="0"/>
-                <w:sz w:val="20"/>
-              </w:rPr>
-              <w:t>Local only</w:t>
+              <w:t>**Local only**</w:t>
             </w:r>
           </w:p>
         </w:tc>
         <w:tc>
           <w:tcPr>
-            <w:tcW w:type="dxa" w:w="3120"/>
+            <w:tcW w:type="dxa" w:w="2880"/>
           </w:tcPr>
           <w:p>
-            <w:r/>
             <w:r>
-              <w:rPr>
-                <w:rFonts w:ascii="Calibri" w:hAnsi="Calibri" w:eastAsia="Calibri"/>
-                <w:b w:val="0"/>
-                <w:i w:val="0"/>
-                <w:sz w:val="20"/>
-              </w:rPr>
               <w:t>Backup if Colab fails</w:t>
             </w:r>
           </w:p>
         </w:tc>
         <w:tc>
           <w:tcPr>
-            <w:tcW w:type="dxa" w:w="3120"/>
+            <w:tcW w:type="dxa" w:w="2880"/>
           </w:tcPr>
           <w:p>
-            <w:r/>
             <w:r>
-              <w:rPr>
-                <w:rFonts w:ascii="Calibri" w:hAnsi="Calibri" w:eastAsia="Calibri"/>
-                <w:b w:val="0"/>
-                <w:i w:val="0"/>
-                <w:sz w:val="20"/>
-              </w:rPr>
               <w:t>CPU slow; Ollama results already saved</w:t>
             </w:r>
           </w:p>
         </w:tc>
       </w:tr>
     </w:tbl>
-    <w:p/>
     <w:p>
       <w:r>
-        <w:rPr>
-          <w:rFonts w:ascii="Calibri" w:hAnsi="Calibri" w:eastAsia="Calibri"/>
-          <w:b w:val="0"/>
-          <w:i w:val="0"/>
-          <w:sz w:val="22"/>
-        </w:rPr>
         <w:t xml:space="preserve">Do </w:t>
       </w:r>
       <w:r>
         <w:rPr>
-          <w:rFonts w:ascii="Calibri" w:hAnsi="Calibri" w:eastAsia="Calibri"/>
           <w:b/>
-          <w:i w:val="0"/>
-          <w:sz w:val="22"/>
         </w:rPr>
         <w:t>not</w:t>
       </w:r>
       <w:r>
-        <w:rPr>
-          <w:rFonts w:ascii="Calibri" w:hAnsi="Calibri" w:eastAsia="Calibri"/>
-          <w:b w:val="0"/>
-          <w:i w:val="0"/>
-          <w:sz w:val="22"/>
-        </w:rPr>
         <w:t xml:space="preserve"> set </w:t>
       </w:r>
       <w:r>
         <w:rPr>
-          <w:rFonts w:ascii="Consolas" w:hAnsi="Consolas" w:eastAsia="Consolas"/>
-          <w:b w:val="0"/>
-          <w:i w:val="0"/>
-          <w:color w:val="333333"/>
-          <w:sz w:val="20"/>
+          <w:rFonts w:ascii="Consolas" w:hAnsi="Consolas"/>
         </w:rPr>
         <w:t>RUN_TEAM_EXPERIMENTS=True</w:t>
       </w:r>
       <w:r>
-        <w:rPr>
-          <w:rFonts w:ascii="Calibri" w:hAnsi="Calibri" w:eastAsia="Calibri"/>
-          <w:b w:val="0"/>
-          <w:i w:val="0"/>
-          <w:sz w:val="22"/>
-        </w:rPr>
         <w:t xml:space="preserve"> during the live demo (full E2–E5 regen takes too long). Show those results from </w:t>
       </w:r>
       <w:r>
         <w:rPr>
-          <w:rFonts w:ascii="Consolas" w:hAnsi="Consolas" w:eastAsia="Consolas"/>
-          <w:b w:val="0"/>
-          <w:i w:val="0"/>
-          <w:color w:val="333333"/>
-          <w:sz w:val="20"/>
+          <w:rFonts w:ascii="Consolas" w:hAnsi="Consolas"/>
         </w:rPr>
         <w:t>evidence/</w:t>
       </w:r>
       <w:r>
-        <w:rPr>
-          <w:rFonts w:ascii="Calibri" w:hAnsi="Calibri" w:eastAsia="Calibri"/>
-          <w:b w:val="0"/>
-          <w:i w:val="0"/>
-          <w:sz w:val="22"/>
-        </w:rPr>
         <w:t>.</w:t>
+      </w:r>
+    </w:p>
+    <w:p>
+      <w:r>
+        <w:t>────────────────────────────────────────</w:t>
       </w:r>
     </w:p>
     <w:p>
@@ -497,12 +311,6 @@
         <w:pStyle w:val="ListNumber"/>
       </w:pPr>
       <w:r>
-        <w:rPr>
-          <w:rFonts w:ascii="Calibri" w:hAnsi="Calibri" w:eastAsia="Calibri"/>
-          <w:b w:val="0"/>
-          <w:i w:val="0"/>
-          <w:sz w:val="22"/>
-        </w:rPr>
         <w:t>Open repo: https://github.com/bits-pgaiml-agai/pcam-zg516-a1-banking77</w:t>
       </w:r>
     </w:p>
@@ -511,31 +319,15 @@
         <w:pStyle w:val="ListNumber"/>
       </w:pPr>
       <w:r>
-        <w:rPr>
-          <w:rFonts w:ascii="Calibri" w:hAnsi="Calibri" w:eastAsia="Calibri"/>
-          <w:b w:val="0"/>
-          <w:i w:val="0"/>
-          <w:sz w:val="22"/>
-        </w:rPr>
         <w:t xml:space="preserve">Upload </w:t>
       </w:r>
       <w:r>
         <w:rPr>
-          <w:rFonts w:ascii="Consolas" w:hAnsi="Consolas" w:eastAsia="Consolas"/>
-          <w:b w:val="0"/>
-          <w:i w:val="0"/>
-          <w:color w:val="333333"/>
-          <w:sz w:val="20"/>
+          <w:rFonts w:ascii="Consolas" w:hAnsi="Consolas"/>
         </w:rPr>
         <w:t>notebooks/BANKING77_GenAI_Assistant.ipynb</w:t>
       </w:r>
       <w:r>
-        <w:rPr>
-          <w:rFonts w:ascii="Calibri" w:hAnsi="Calibri" w:eastAsia="Calibri"/>
-          <w:b w:val="0"/>
-          <w:i w:val="0"/>
-          <w:sz w:val="22"/>
-        </w:rPr>
         <w:t xml:space="preserve"> to Google Colab</w:t>
       </w:r>
     </w:p>
@@ -545,10 +337,7 @@
       </w:pPr>
       <w:r>
         <w:rPr>
-          <w:rFonts w:ascii="Calibri" w:hAnsi="Calibri" w:eastAsia="Calibri"/>
           <w:b/>
-          <w:i w:val="0"/>
-          <w:sz w:val="22"/>
         </w:rPr>
         <w:t>Runtime → Change runtime type → T4 GPU</w:t>
       </w:r>
@@ -558,12 +347,6 @@
         <w:pStyle w:val="ListNumber"/>
       </w:pPr>
       <w:r>
-        <w:rPr>
-          <w:rFonts w:ascii="Calibri" w:hAnsi="Calibri" w:eastAsia="Calibri"/>
-          <w:b w:val="0"/>
-          <w:i w:val="0"/>
-          <w:sz w:val="22"/>
-        </w:rPr>
         <w:t>Keep flags:</w:t>
       </w:r>
     </w:p>
@@ -573,11 +356,7 @@
       </w:pPr>
       <w:r>
         <w:rPr>
-          <w:rFonts w:ascii="Consolas" w:hAnsi="Consolas" w:eastAsia="Consolas"/>
-          <w:b w:val="0"/>
-          <w:i w:val="0"/>
-          <w:color w:val="333333"/>
-          <w:sz w:val="20"/>
+          <w:rFonts w:ascii="Consolas" w:hAnsi="Consolas"/>
         </w:rPr>
         <w:t>RUN_TEAM_EXPERIMENTS = False</w:t>
       </w:r>
@@ -588,11 +367,7 @@
       </w:pPr>
       <w:r>
         <w:rPr>
-          <w:rFonts w:ascii="Consolas" w:hAnsi="Consolas" w:eastAsia="Consolas"/>
-          <w:b w:val="0"/>
-          <w:i w:val="0"/>
-          <w:color w:val="333333"/>
-          <w:sz w:val="20"/>
+          <w:rFonts w:ascii="Consolas" w:hAnsi="Consolas"/>
         </w:rPr>
         <w:t>RUN_FINAL_EVAL = False</w:t>
       </w:r>
@@ -602,12 +377,6 @@
         <w:pStyle w:val="ListNumber"/>
       </w:pPr>
       <w:r>
-        <w:rPr>
-          <w:rFonts w:ascii="Calibri" w:hAnsi="Calibri" w:eastAsia="Calibri"/>
-          <w:b w:val="0"/>
-          <w:i w:val="0"/>
-          <w:sz w:val="22"/>
-        </w:rPr>
         <w:t>Run top cells once so the model is cached (or accept using evidence if download is slow)</w:t>
       </w:r>
     </w:p>
@@ -616,12 +385,6 @@
         <w:pStyle w:val="ListNumber"/>
       </w:pPr>
       <w:r>
-        <w:rPr>
-          <w:rFonts w:ascii="Calibri" w:hAnsi="Calibri" w:eastAsia="Calibri"/>
-          <w:b w:val="0"/>
-          <w:i w:val="0"/>
-          <w:sz w:val="22"/>
-        </w:rPr>
         <w:t>Keep these folders ready in a second tab / File Explorer:</w:t>
       </w:r>
     </w:p>
@@ -631,11 +394,7 @@
       </w:pPr>
       <w:r>
         <w:rPr>
-          <w:rFonts w:ascii="Consolas" w:hAnsi="Consolas" w:eastAsia="Consolas"/>
-          <w:b w:val="0"/>
-          <w:i w:val="0"/>
-          <w:color w:val="333333"/>
-          <w:sz w:val="20"/>
+          <w:rFonts w:ascii="Consolas" w:hAnsi="Consolas"/>
         </w:rPr>
         <w:t>evidence/baseline/</w:t>
       </w:r>
@@ -646,11 +405,7 @@
       </w:pPr>
       <w:r>
         <w:rPr>
-          <w:rFonts w:ascii="Consolas" w:hAnsi="Consolas" w:eastAsia="Consolas"/>
-          <w:b w:val="0"/>
-          <w:i w:val="0"/>
-          <w:color w:val="333333"/>
-          <w:sz w:val="20"/>
+          <w:rFonts w:ascii="Consolas" w:hAnsi="Consolas"/>
         </w:rPr>
         <w:t>evidence/prompts_decoding/</w:t>
       </w:r>
@@ -661,11 +416,7 @@
       </w:pPr>
       <w:r>
         <w:rPr>
-          <w:rFonts w:ascii="Consolas" w:hAnsi="Consolas" w:eastAsia="Consolas"/>
-          <w:b w:val="0"/>
-          <w:i w:val="0"/>
-          <w:color w:val="333333"/>
-          <w:sz w:val="20"/>
+          <w:rFonts w:ascii="Consolas" w:hAnsi="Consolas"/>
         </w:rPr>
         <w:t>evidence/structured_tools/</w:t>
       </w:r>
@@ -676,11 +427,7 @@
       </w:pPr>
       <w:r>
         <w:rPr>
-          <w:rFonts w:ascii="Consolas" w:hAnsi="Consolas" w:eastAsia="Consolas"/>
-          <w:b w:val="0"/>
-          <w:i w:val="0"/>
-          <w:color w:val="333333"/>
-          <w:sz w:val="20"/>
+          <w:rFonts w:ascii="Consolas" w:hAnsi="Consolas"/>
         </w:rPr>
         <w:t>evidence/evaluation/</w:t>
       </w:r>
@@ -690,23 +437,18 @@
         <w:pStyle w:val="ListNumber"/>
       </w:pPr>
       <w:r>
-        <w:rPr>
-          <w:rFonts w:ascii="Calibri" w:hAnsi="Calibri" w:eastAsia="Calibri"/>
-          <w:b w:val="0"/>
-          <w:i w:val="0"/>
-          <w:sz w:val="22"/>
-        </w:rPr>
         <w:t xml:space="preserve">Rehearse from </w:t>
       </w:r>
       <w:r>
         <w:rPr>
-          <w:rFonts w:ascii="Consolas" w:hAnsi="Consolas" w:eastAsia="Consolas"/>
-          <w:b w:val="0"/>
-          <w:i w:val="0"/>
-          <w:color w:val="333333"/>
-          <w:sz w:val="20"/>
+          <w:rFonts w:ascii="Consolas" w:hAnsi="Consolas"/>
         </w:rPr>
         <w:t>Group15_Demo_Speaking_Script.docx</w:t>
+      </w:r>
+    </w:p>
+    <w:p>
+      <w:r>
+        <w:t>────────────────────────────────────────</w:t>
       </w:r>
     </w:p>
     <w:p>
@@ -730,12 +472,6 @@
         <w:pStyle w:val="ListBullet"/>
       </w:pPr>
       <w:r>
-        <w:rPr>
-          <w:rFonts w:ascii="Calibri" w:hAnsi="Calibri" w:eastAsia="Calibri"/>
-          <w:b w:val="0"/>
-          <w:i w:val="0"/>
-          <w:sz w:val="22"/>
-        </w:rPr>
         <w:t>Screen: README or title</w:t>
       </w:r>
     </w:p>
@@ -744,12 +480,6 @@
         <w:pStyle w:val="ListBullet"/>
       </w:pPr>
       <w:r>
-        <w:rPr>
-          <w:rFonts w:ascii="Calibri" w:hAnsi="Calibri" w:eastAsia="Calibri"/>
-          <w:b w:val="0"/>
-          <w:i w:val="0"/>
-          <w:sz w:val="22"/>
-        </w:rPr>
         <w:t>Say: problem, prompting-only, simulation, not a real bank</w:t>
       </w:r>
     </w:p>
@@ -764,10 +494,7 @@
     <w:p>
       <w:r>
         <w:rPr>
-          <w:rFonts w:ascii="Calibri" w:hAnsi="Calibri" w:eastAsia="Calibri"/>
           <w:b/>
-          <w:i w:val="0"/>
-          <w:sz w:val="22"/>
         </w:rPr>
         <w:t>Show in Colab (or evidence if Colab is cold):</w:t>
       </w:r>
@@ -777,12 +504,6 @@
         <w:pStyle w:val="ListNumber"/>
       </w:pPr>
       <w:r>
-        <w:rPr>
-          <w:rFonts w:ascii="Calibri" w:hAnsi="Calibri" w:eastAsia="Calibri"/>
-          <w:b w:val="0"/>
-          <w:i w:val="0"/>
-          <w:sz w:val="22"/>
-        </w:rPr>
         <w:t>Config cell — seed 42, model name, flags False</w:t>
       </w:r>
     </w:p>
@@ -791,31 +512,15 @@
         <w:pStyle w:val="ListNumber"/>
       </w:pPr>
       <w:r>
-        <w:rPr>
-          <w:rFonts w:ascii="Calibri" w:hAnsi="Calibri" w:eastAsia="Calibri"/>
-          <w:b w:val="0"/>
-          <w:i w:val="0"/>
-          <w:sz w:val="22"/>
-        </w:rPr>
         <w:t xml:space="preserve">Data/subset cells — </w:t>
       </w:r>
       <w:r>
         <w:rPr>
-          <w:rFonts w:ascii="Consolas" w:hAnsi="Consolas" w:eastAsia="Consolas"/>
-          <w:b w:val="0"/>
-          <w:i w:val="0"/>
-          <w:color w:val="333333"/>
-          <w:sz w:val="20"/>
+          <w:rFonts w:ascii="Consolas" w:hAnsi="Consolas"/>
         </w:rPr>
         <w:t>development_evaluation.csv</w:t>
       </w:r>
       <w:r>
-        <w:rPr>
-          <w:rFonts w:ascii="Calibri" w:hAnsi="Calibri" w:eastAsia="Calibri"/>
-          <w:b w:val="0"/>
-          <w:i w:val="0"/>
-          <w:sz w:val="22"/>
-        </w:rPr>
         <w:t xml:space="preserve"> (40) vs reserved test</w:t>
       </w:r>
     </w:p>
@@ -824,12 +529,6 @@
         <w:pStyle w:val="ListNumber"/>
       </w:pPr>
       <w:r>
-        <w:rPr>
-          <w:rFonts w:ascii="Calibri" w:hAnsi="Calibri" w:eastAsia="Calibri"/>
-          <w:b w:val="0"/>
-          <w:i w:val="0"/>
-          <w:sz w:val="22"/>
-        </w:rPr>
         <w:t>E1 results:</w:t>
       </w:r>
     </w:p>
@@ -838,20 +537,11 @@
         <w:pStyle w:val="ListBullet"/>
       </w:pPr>
       <w:r>
-        <w:rPr>
-          <w:rFonts w:ascii="Calibri" w:hAnsi="Calibri" w:eastAsia="Calibri"/>
-          <w:b w:val="0"/>
-          <w:i w:val="0"/>
-          <w:sz w:val="22"/>
-        </w:rPr>
         <w:t xml:space="preserve">Live: run E1 cell if ready, </w:t>
       </w:r>
       <w:r>
         <w:rPr>
-          <w:rFonts w:ascii="Calibri" w:hAnsi="Calibri" w:eastAsia="Calibri"/>
           <w:b/>
-          <w:i w:val="0"/>
-          <w:sz w:val="22"/>
         </w:rPr>
         <w:t>or</w:t>
       </w:r>
@@ -861,39 +551,20 @@
         <w:pStyle w:val="ListBullet"/>
       </w:pPr>
       <w:r>
-        <w:rPr>
-          <w:rFonts w:ascii="Calibri" w:hAnsi="Calibri" w:eastAsia="Calibri"/>
-          <w:b w:val="0"/>
-          <w:i w:val="0"/>
-          <w:sz w:val="22"/>
-        </w:rPr>
         <w:t xml:space="preserve">File: </w:t>
       </w:r>
       <w:r>
         <w:rPr>
-          <w:rFonts w:ascii="Consolas" w:hAnsi="Consolas" w:eastAsia="Consolas"/>
-          <w:b w:val="0"/>
-          <w:i w:val="0"/>
-          <w:color w:val="333333"/>
-          <w:sz w:val="20"/>
+          <w:rFonts w:ascii="Consolas" w:hAnsi="Consolas"/>
         </w:rPr>
         <w:t>evidence/baseline/E1_summary.json</w:t>
       </w:r>
       <w:r>
-        <w:rPr>
-          <w:rFonts w:ascii="Calibri" w:hAnsi="Calibri" w:eastAsia="Calibri"/>
-          <w:b w:val="0"/>
-          <w:i w:val="0"/>
-          <w:sz w:val="22"/>
-        </w:rPr>
         <w:t xml:space="preserve"> → </w:t>
       </w:r>
       <w:r>
         <w:rPr>
-          <w:rFonts w:ascii="Calibri" w:hAnsi="Calibri" w:eastAsia="Calibri"/>
           <w:b/>
-          <w:i w:val="0"/>
-          <w:sz w:val="22"/>
         </w:rPr>
         <w:t>0/3 schema, 0/3 intent</w:t>
       </w:r>
@@ -903,31 +574,15 @@
         <w:pStyle w:val="ListBullet"/>
       </w:pPr>
       <w:r>
-        <w:rPr>
-          <w:rFonts w:ascii="Calibri" w:hAnsi="Calibri" w:eastAsia="Calibri"/>
-          <w:b w:val="0"/>
-          <w:i w:val="0"/>
-          <w:sz w:val="22"/>
-        </w:rPr>
         <w:t xml:space="preserve">File: one bad line in </w:t>
       </w:r>
       <w:r>
         <w:rPr>
-          <w:rFonts w:ascii="Consolas" w:hAnsi="Consolas" w:eastAsia="Consolas"/>
-          <w:b w:val="0"/>
-          <w:i w:val="0"/>
-          <w:color w:val="333333"/>
-          <w:sz w:val="20"/>
+          <w:rFonts w:ascii="Consolas" w:hAnsi="Consolas"/>
         </w:rPr>
         <w:t>E1_baseline_outputs.jsonl</w:t>
       </w:r>
       <w:r>
-        <w:rPr>
-          <w:rFonts w:ascii="Calibri" w:hAnsi="Calibri" w:eastAsia="Calibri"/>
-          <w:b w:val="0"/>
-          <w:i w:val="0"/>
-          <w:sz w:val="22"/>
-        </w:rPr>
         <w:t xml:space="preserve"> (Markdown / invented label / card ask)</w:t>
       </w:r>
     </w:p>
@@ -941,12 +596,6 @@
     </w:p>
     <w:p>
       <w:r>
-        <w:rPr>
-          <w:rFonts w:ascii="Calibri" w:hAnsi="Calibri" w:eastAsia="Calibri"/>
-          <w:b w:val="0"/>
-          <w:i w:val="0"/>
-          <w:sz w:val="22"/>
-        </w:rPr>
         <w:t>Open:</w:t>
       </w:r>
     </w:p>
@@ -956,30 +605,16 @@
       </w:pPr>
       <w:r>
         <w:rPr>
-          <w:rFonts w:ascii="Consolas" w:hAnsi="Consolas" w:eastAsia="Consolas"/>
-          <w:b w:val="0"/>
-          <w:i w:val="0"/>
-          <w:color w:val="333333"/>
-          <w:sz w:val="20"/>
+          <w:rFonts w:ascii="Consolas" w:hAnsi="Consolas"/>
         </w:rPr>
         <w:t>evidence/prompts_decoding/E2_prompt_comparison.csv</w:t>
       </w:r>
       <w:r>
-        <w:rPr>
-          <w:rFonts w:ascii="Calibri" w:hAnsi="Calibri" w:eastAsia="Calibri"/>
-          <w:b w:val="0"/>
-          <w:i w:val="0"/>
-          <w:sz w:val="22"/>
-        </w:rPr>
         <w:t xml:space="preserve"> or </w:t>
       </w:r>
       <w:r>
         <w:rPr>
-          <w:rFonts w:ascii="Consolas" w:hAnsi="Consolas" w:eastAsia="Consolas"/>
-          <w:b w:val="0"/>
-          <w:i w:val="0"/>
-          <w:color w:val="333333"/>
-          <w:sz w:val="20"/>
+          <w:rFonts w:ascii="Consolas" w:hAnsi="Consolas"/>
         </w:rPr>
         <w:t>E2_summary.json</w:t>
       </w:r>
@@ -989,56 +624,29 @@
         <w:pStyle w:val="ListBullet"/>
       </w:pPr>
       <w:r>
-        <w:rPr>
-          <w:rFonts w:ascii="Calibri" w:hAnsi="Calibri" w:eastAsia="Calibri"/>
-          <w:b w:val="0"/>
-          <w:i w:val="0"/>
-          <w:sz w:val="22"/>
-        </w:rPr>
         <w:t xml:space="preserve">Four variants, n=10; best </w:t>
       </w:r>
       <w:r>
         <w:rPr>
-          <w:rFonts w:ascii="Calibri" w:hAnsi="Calibri" w:eastAsia="Calibri"/>
           <w:b/>
-          <w:i w:val="0"/>
-          <w:sz w:val="22"/>
         </w:rPr>
         <w:t>zero_shot</w:t>
       </w:r>
       <w:r>
-        <w:rPr>
-          <w:rFonts w:ascii="Calibri" w:hAnsi="Calibri" w:eastAsia="Calibri"/>
-          <w:b w:val="0"/>
-          <w:i w:val="0"/>
-          <w:sz w:val="22"/>
-        </w:rPr>
         <w:t xml:space="preserve"> JSON </w:t>
       </w:r>
       <w:r>
         <w:rPr>
-          <w:rFonts w:ascii="Calibri" w:hAnsi="Calibri" w:eastAsia="Calibri"/>
           <w:b/>
-          <w:i w:val="0"/>
-          <w:sz w:val="22"/>
         </w:rPr>
         <w:t>0.60</w:t>
       </w:r>
       <w:r>
-        <w:rPr>
-          <w:rFonts w:ascii="Calibri" w:hAnsi="Calibri" w:eastAsia="Calibri"/>
-          <w:b w:val="0"/>
-          <w:i w:val="0"/>
-          <w:sz w:val="22"/>
-        </w:rPr>
         <w:t xml:space="preserve">, intent </w:t>
       </w:r>
       <w:r>
         <w:rPr>
-          <w:rFonts w:ascii="Calibri" w:hAnsi="Calibri" w:eastAsia="Calibri"/>
           <w:b/>
-          <w:i w:val="0"/>
-          <w:sz w:val="22"/>
         </w:rPr>
         <w:t>0.10</w:t>
       </w:r>
@@ -1048,50 +656,24 @@
         <w:pStyle w:val="ListNumber"/>
       </w:pPr>
       <w:r>
-        <w:rPr>
-          <w:rFonts w:ascii="Calibri" w:hAnsi="Calibri" w:eastAsia="Calibri"/>
-          <w:b w:val="0"/>
-          <w:i w:val="0"/>
-          <w:sz w:val="22"/>
-        </w:rPr>
         <w:t xml:space="preserve">Optional: </w:t>
       </w:r>
       <w:r>
         <w:rPr>
-          <w:rFonts w:ascii="Consolas" w:hAnsi="Consolas" w:eastAsia="Consolas"/>
-          <w:b w:val="0"/>
-          <w:i w:val="0"/>
-          <w:color w:val="333333"/>
-          <w:sz w:val="20"/>
+          <w:rFonts w:ascii="Consolas" w:hAnsi="Consolas"/>
         </w:rPr>
         <w:t>prompts/ACTUAL_PROMPTS_E2.md</w:t>
       </w:r>
       <w:r>
-        <w:rPr>
-          <w:rFonts w:ascii="Calibri" w:hAnsi="Calibri" w:eastAsia="Calibri"/>
-          <w:b w:val="0"/>
-          <w:i w:val="0"/>
-          <w:sz w:val="22"/>
-        </w:rPr>
         <w:t xml:space="preserve"> or one </w:t>
       </w:r>
       <w:r>
         <w:rPr>
-          <w:rFonts w:ascii="Consolas" w:hAnsi="Consolas" w:eastAsia="Consolas"/>
-          <w:b w:val="0"/>
-          <w:i w:val="0"/>
-          <w:color w:val="333333"/>
-          <w:sz w:val="20"/>
+          <w:rFonts w:ascii="Consolas" w:hAnsi="Consolas"/>
         </w:rPr>
         <w:t>prompts/sample_rendered_*.json</w:t>
       </w:r>
       <w:r>
-        <w:rPr>
-          <w:rFonts w:ascii="Calibri" w:hAnsi="Calibri" w:eastAsia="Calibri"/>
-          <w:b w:val="0"/>
-          <w:i w:val="0"/>
-          <w:sz w:val="22"/>
-        </w:rPr>
         <w:t xml:space="preserve"> — show the exact Task line / few-shot block</w:t>
       </w:r>
     </w:p>
@@ -1101,30 +683,16 @@
       </w:pPr>
       <w:r>
         <w:rPr>
-          <w:rFonts w:ascii="Consolas" w:hAnsi="Consolas" w:eastAsia="Consolas"/>
-          <w:b w:val="0"/>
-          <w:i w:val="0"/>
-          <w:color w:val="333333"/>
-          <w:sz w:val="20"/>
+          <w:rFonts w:ascii="Consolas" w:hAnsi="Consolas"/>
         </w:rPr>
         <w:t>E3_decoding_summary.csv</w:t>
       </w:r>
       <w:r>
-        <w:rPr>
-          <w:rFonts w:ascii="Calibri" w:hAnsi="Calibri" w:eastAsia="Calibri"/>
-          <w:b w:val="0"/>
-          <w:i w:val="0"/>
-          <w:sz w:val="22"/>
-        </w:rPr>
         <w:t xml:space="preserve"> / </w:t>
       </w:r>
       <w:r>
         <w:rPr>
-          <w:rFonts w:ascii="Consolas" w:hAnsi="Consolas" w:eastAsia="Consolas"/>
-          <w:b w:val="0"/>
-          <w:i w:val="0"/>
-          <w:color w:val="333333"/>
-          <w:sz w:val="20"/>
+          <w:rFonts w:ascii="Consolas" w:hAnsi="Consolas"/>
         </w:rPr>
         <w:t>E3_summary.json</w:t>
       </w:r>
@@ -1134,30 +702,15 @@
         <w:pStyle w:val="ListBullet"/>
       </w:pPr>
       <w:r>
-        <w:rPr>
-          <w:rFonts w:ascii="Calibri" w:hAnsi="Calibri" w:eastAsia="Calibri"/>
-          <w:b w:val="0"/>
-          <w:i w:val="0"/>
-          <w:sz w:val="22"/>
-        </w:rPr>
         <w:t xml:space="preserve">Prefer </w:t>
       </w:r>
       <w:r>
         <w:rPr>
-          <w:rFonts w:ascii="Calibri" w:hAnsi="Calibri" w:eastAsia="Calibri"/>
           <w:b/>
-          <w:i w:val="0"/>
-          <w:sz w:val="22"/>
         </w:rPr>
         <w:t>greedy</w:t>
       </w:r>
       <w:r>
-        <w:rPr>
-          <w:rFonts w:ascii="Calibri" w:hAnsi="Calibri" w:eastAsia="Calibri"/>
-          <w:b w:val="0"/>
-          <w:i w:val="0"/>
-          <w:sz w:val="22"/>
-        </w:rPr>
         <w:t xml:space="preserve"> for structured JSON</w:t>
       </w:r>
     </w:p>
@@ -1166,31 +719,15 @@
         <w:pStyle w:val="ListNumber"/>
       </w:pPr>
       <w:r>
-        <w:rPr>
-          <w:rFonts w:ascii="Calibri" w:hAnsi="Calibri" w:eastAsia="Calibri"/>
-          <w:b w:val="0"/>
-          <w:i w:val="0"/>
-          <w:sz w:val="22"/>
-        </w:rPr>
         <w:t xml:space="preserve">Optional one line: </w:t>
       </w:r>
       <w:r>
         <w:rPr>
-          <w:rFonts w:ascii="Consolas" w:hAnsi="Consolas" w:eastAsia="Consolas"/>
-          <w:b w:val="0"/>
-          <w:i w:val="0"/>
-          <w:color w:val="333333"/>
-          <w:sz w:val="20"/>
+          <w:rFonts w:ascii="Consolas" w:hAnsi="Consolas"/>
         </w:rPr>
         <w:t>docs/MODEL_COMPARISON_OLLAMA.md</w:t>
       </w:r>
       <w:r>
-        <w:rPr>
-          <w:rFonts w:ascii="Calibri" w:hAnsi="Calibri" w:eastAsia="Calibri"/>
-          <w:b w:val="0"/>
-          <w:i w:val="0"/>
-          <w:sz w:val="22"/>
-        </w:rPr>
         <w:t xml:space="preserve"> (3b stronger; we standardize on 1.5b-instruct)</w:t>
       </w:r>
     </w:p>
@@ -1208,21 +745,11 @@
       </w:pPr>
       <w:r>
         <w:rPr>
-          <w:rFonts w:ascii="Consolas" w:hAnsi="Consolas" w:eastAsia="Consolas"/>
-          <w:b w:val="0"/>
-          <w:i w:val="0"/>
-          <w:color w:val="333333"/>
-          <w:sz w:val="20"/>
+          <w:rFonts w:ascii="Consolas" w:hAnsi="Consolas"/>
         </w:rPr>
         <w:t>schemas/response.schema.json</w:t>
       </w:r>
       <w:r>
-        <w:rPr>
-          <w:rFonts w:ascii="Calibri" w:hAnsi="Calibri" w:eastAsia="Calibri"/>
-          <w:b w:val="0"/>
-          <w:i w:val="0"/>
-          <w:sz w:val="22"/>
-        </w:rPr>
         <w:t xml:space="preserve"> — five keys</w:t>
       </w:r>
     </w:p>
@@ -1232,29 +759,16 @@
       </w:pPr>
       <w:r>
         <w:rPr>
-          <w:rFonts w:ascii="Consolas" w:hAnsi="Consolas" w:eastAsia="Consolas"/>
-          <w:b w:val="0"/>
-          <w:i w:val="0"/>
-          <w:color w:val="333333"/>
-          <w:sz w:val="20"/>
+          <w:rFonts w:ascii="Consolas" w:hAnsi="Consolas"/>
         </w:rPr>
         <w:t>evidence/structured_tools/E4_summary.json</w:t>
       </w:r>
       <w:r>
-        <w:rPr>
-          <w:rFonts w:ascii="Calibri" w:hAnsi="Calibri" w:eastAsia="Calibri"/>
-          <w:b w:val="0"/>
-          <w:i w:val="0"/>
-          <w:sz w:val="22"/>
-        </w:rPr>
         <w:t xml:space="preserve"> — </w:t>
       </w:r>
       <w:r>
         <w:rPr>
-          <w:rFonts w:ascii="Calibri" w:hAnsi="Calibri" w:eastAsia="Calibri"/>
           <w:b/>
-          <w:i w:val="0"/>
-          <w:sz w:val="22"/>
         </w:rPr>
         <w:t>10/10</w:t>
       </w:r>
@@ -1265,31 +779,19 @@
       </w:pPr>
       <w:r>
         <w:rPr>
-          <w:rFonts w:ascii="Calibri" w:hAnsi="Calibri" w:eastAsia="Calibri"/>
           <w:b/>
-          <w:i w:val="0"/>
-          <w:sz w:val="22"/>
         </w:rPr>
         <w:t>Live in Colab</w:t>
       </w:r>
       <w:r>
-        <w:rPr>
-          <w:rFonts w:ascii="Calibri" w:hAnsi="Calibri" w:eastAsia="Calibri"/>
-          <w:b w:val="0"/>
-          <w:i w:val="0"/>
-          <w:sz w:val="22"/>
-        </w:rPr>
         <w:t xml:space="preserve"> (tool cell works without full LLM wait):</w:t>
       </w:r>
     </w:p>
     <w:p>
       <w:r>
         <w:rPr>
-          <w:rFonts w:ascii="Consolas" w:hAnsi="Consolas" w:eastAsia="Consolas"/>
-          <w:b w:val="0"/>
-          <w:i w:val="0"/>
-          <w:color w:val="333333"/>
-          <w:sz w:val="20"/>
+          <w:rFonts w:ascii="Consolas" w:hAnsi="Consolas"/>
+          <w:sz w:val="18"/>
         </w:rPr>
         <w:t>dispatch_tool("transaction_status_lookup", {"transaction_id": "TXN-DEMO-001"})</w:t>
         <w:br/>
@@ -1301,31 +803,15 @@
         <w:pStyle w:val="ListNumber"/>
       </w:pPr>
       <w:r>
-        <w:rPr>
-          <w:rFonts w:ascii="Calibri" w:hAnsi="Calibri" w:eastAsia="Calibri"/>
-          <w:b w:val="0"/>
-          <w:i w:val="0"/>
-          <w:sz w:val="22"/>
-        </w:rPr>
         <w:t xml:space="preserve">Optional: </w:t>
       </w:r>
       <w:r>
         <w:rPr>
-          <w:rFonts w:ascii="Consolas" w:hAnsi="Consolas" w:eastAsia="Consolas"/>
-          <w:b w:val="0"/>
-          <w:i w:val="0"/>
-          <w:color w:val="333333"/>
-          <w:sz w:val="20"/>
+          <w:rFonts w:ascii="Consolas" w:hAnsi="Consolas"/>
         </w:rPr>
         <w:t>E5_integrated_tool_demo.json</w:t>
       </w:r>
       <w:r>
-        <w:rPr>
-          <w:rFonts w:ascii="Calibri" w:hAnsi="Calibri" w:eastAsia="Calibri"/>
-          <w:b w:val="0"/>
-          <w:i w:val="0"/>
-          <w:sz w:val="22"/>
-        </w:rPr>
         <w:t xml:space="preserve"> — invalid LLM JSON blocked the tool</w:t>
       </w:r>
     </w:p>
@@ -1342,12 +828,6 @@
         <w:pStyle w:val="ListNumber"/>
       </w:pPr>
       <w:r>
-        <w:rPr>
-          <w:rFonts w:ascii="Calibri" w:hAnsi="Calibri" w:eastAsia="Calibri"/>
-          <w:b w:val="0"/>
-          <w:i w:val="0"/>
-          <w:sz w:val="22"/>
-        </w:rPr>
         <w:t>Architecture: prompt → generate → validate → tool/fallback</w:t>
       </w:r>
     </w:p>
@@ -1357,21 +837,11 @@
       </w:pPr>
       <w:r>
         <w:rPr>
-          <w:rFonts w:ascii="Consolas" w:hAnsi="Consolas" w:eastAsia="Consolas"/>
-          <w:b w:val="0"/>
-          <w:i w:val="0"/>
-          <w:color w:val="333333"/>
-          <w:sz w:val="20"/>
+          <w:rFonts w:ascii="Consolas" w:hAnsi="Consolas"/>
         </w:rPr>
         <w:t>evidence/evaluation/E6_failure_analysis.csv</w:t>
       </w:r>
       <w:r>
-        <w:rPr>
-          <w:rFonts w:ascii="Calibri" w:hAnsi="Calibri" w:eastAsia="Calibri"/>
-          <w:b w:val="0"/>
-          <w:i w:val="0"/>
-          <w:sz w:val="22"/>
-        </w:rPr>
         <w:t xml:space="preserve"> — F1, F2, F3</w:t>
       </w:r>
     </w:p>
@@ -1380,12 +850,6 @@
         <w:pStyle w:val="ListNumber"/>
       </w:pPr>
       <w:r>
-        <w:rPr>
-          <w:rFonts w:ascii="Calibri" w:hAnsi="Calibri" w:eastAsia="Calibri"/>
-          <w:b w:val="0"/>
-          <w:i w:val="0"/>
-          <w:sz w:val="22"/>
-        </w:rPr>
         <w:t>State four metrics separately: intent, schema, safety, tool</w:t>
       </w:r>
     </w:p>
@@ -1395,11 +859,7 @@
       </w:pPr>
       <w:r>
         <w:rPr>
-          <w:rFonts w:ascii="Consolas" w:hAnsi="Consolas" w:eastAsia="Consolas"/>
-          <w:b w:val="0"/>
-          <w:i w:val="0"/>
-          <w:color w:val="333333"/>
-          <w:sz w:val="20"/>
+          <w:rFonts w:ascii="Consolas" w:hAnsi="Consolas"/>
         </w:rPr>
         <w:t>evidence/evaluation/E7_integration_checklist.md</w:t>
       </w:r>
@@ -1417,13 +877,12 @@
         <w:pStyle w:val="ListBullet"/>
       </w:pPr>
       <w:r>
-        <w:rPr>
-          <w:rFonts w:ascii="Calibri" w:hAnsi="Calibri" w:eastAsia="Calibri"/>
-          <w:b w:val="0"/>
-          <w:i w:val="0"/>
-          <w:sz w:val="22"/>
-        </w:rPr>
         <w:t>Simulation only; small n; no full 77-class claim; Q&amp;A</w:t>
+      </w:r>
+    </w:p>
+    <w:p>
+      <w:r>
+        <w:t>────────────────────────────────────────</w:t>
       </w:r>
     </w:p>
     <w:p>
@@ -1437,66 +896,44 @@
     <w:p>
       <w:r>
         <w:rPr>
-          <w:rFonts w:ascii="Calibri" w:hAnsi="Calibri" w:eastAsia="Calibri"/>
           <w:b/>
-          <w:i w:val="0"/>
-          <w:sz w:val="22"/>
         </w:rPr>
         <w:t>Use Colab if</w:t>
       </w:r>
       <w:r>
-        <w:rPr>
-          <w:rFonts w:ascii="Calibri" w:hAnsi="Calibri" w:eastAsia="Calibri"/>
-          <w:b w:val="0"/>
-          <w:i w:val="0"/>
-          <w:sz w:val="22"/>
-        </w:rPr>
         <w:t xml:space="preserve"> you can get T4 and finish install + model load before recording.</w:t>
       </w:r>
     </w:p>
     <w:p>
       <w:r>
         <w:rPr>
-          <w:rFonts w:ascii="Calibri" w:hAnsi="Calibri" w:eastAsia="Calibri"/>
           <w:b/>
-          <w:i w:val="0"/>
-          <w:sz w:val="22"/>
         </w:rPr>
         <w:t>Use evidence-first if</w:t>
       </w:r>
       <w:r>
-        <w:rPr>
-          <w:rFonts w:ascii="Calibri" w:hAnsi="Calibri" w:eastAsia="Calibri"/>
-          <w:b w:val="0"/>
-          <w:i w:val="0"/>
-          <w:sz w:val="22"/>
-        </w:rPr>
         <w:t xml:space="preserve"> Colab is slow, HF download fails, or you have a hard 10-minute stop.</w:t>
       </w:r>
     </w:p>
     <w:p>
       <w:r>
-        <w:rPr>
-          <w:rFonts w:ascii="Calibri" w:hAnsi="Calibri" w:eastAsia="Calibri"/>
-          <w:b w:val="0"/>
-          <w:i w:val="0"/>
-          <w:sz w:val="22"/>
-        </w:rPr>
         <w:t>Local tool-only backup:</w:t>
       </w:r>
     </w:p>
     <w:p>
       <w:r>
         <w:rPr>
-          <w:rFonts w:ascii="Consolas" w:hAnsi="Consolas" w:eastAsia="Consolas"/>
-          <w:b w:val="0"/>
-          <w:i w:val="0"/>
-          <w:color w:val="333333"/>
-          <w:sz w:val="20"/>
+          <w:rFonts w:ascii="Consolas" w:hAnsi="Consolas"/>
+          <w:sz w:val="18"/>
         </w:rPr>
         <w:t>cd pcam-zg516-a1-banking77</w:t>
         <w:br/>
         <w:t>python -c "from src.tools import dispatch_tool; print(dispatch_tool('transaction_status_lookup', {'transaction_id':'TXN-DEMO-001'}))"</w:t>
+      </w:r>
+    </w:p>
+    <w:p>
+      <w:r>
+        <w:t>────────────────────────────────────────</w:t>
       </w:r>
     </w:p>
     <w:p>
@@ -1512,12 +949,6 @@
         <w:pStyle w:val="ListBullet"/>
       </w:pPr>
       <w:r>
-        <w:rPr>
-          <w:rFonts w:ascii="Calibri" w:hAnsi="Calibri" w:eastAsia="Calibri"/>
-          <w:b w:val="0"/>
-          <w:i w:val="0"/>
-          <w:sz w:val="22"/>
-        </w:rPr>
         <w:t>Do not re-run full E2 or E3 during the video</w:t>
       </w:r>
     </w:p>
@@ -1526,21 +957,11 @@
         <w:pStyle w:val="ListBullet"/>
       </w:pPr>
       <w:r>
-        <w:rPr>
-          <w:rFonts w:ascii="Calibri" w:hAnsi="Calibri" w:eastAsia="Calibri"/>
-          <w:b w:val="0"/>
-          <w:i w:val="0"/>
-          <w:sz w:val="22"/>
-        </w:rPr>
         <w:t xml:space="preserve">Do not enable </w:t>
       </w:r>
       <w:r>
         <w:rPr>
-          <w:rFonts w:ascii="Consolas" w:hAnsi="Consolas" w:eastAsia="Consolas"/>
-          <w:b w:val="0"/>
-          <w:i w:val="0"/>
-          <w:color w:val="333333"/>
-          <w:sz w:val="20"/>
+          <w:rFonts w:ascii="Consolas" w:hAnsi="Consolas"/>
         </w:rPr>
         <w:t>RUN_FINAL_EVAL</w:t>
       </w:r>
@@ -1550,12 +971,6 @@
         <w:pStyle w:val="ListBullet"/>
       </w:pPr>
       <w:r>
-        <w:rPr>
-          <w:rFonts w:ascii="Calibri" w:hAnsi="Calibri" w:eastAsia="Calibri"/>
-          <w:b w:val="0"/>
-          <w:i w:val="0"/>
-          <w:sz w:val="22"/>
-        </w:rPr>
         <w:t>Do not invent better accuracy than the JSON/CSV summaries</w:t>
       </w:r>
     </w:p>
@@ -1564,13 +979,12 @@
         <w:pStyle w:val="ListBullet"/>
       </w:pPr>
       <w:r>
-        <w:rPr>
-          <w:rFonts w:ascii="Calibri" w:hAnsi="Calibri" w:eastAsia="Calibri"/>
-          <w:b w:val="0"/>
-          <w:i w:val="0"/>
-          <w:sz w:val="22"/>
-        </w:rPr>
         <w:t>Do not show real personal or financial data</w:t>
+      </w:r>
+    </w:p>
+    <w:p>
+      <w:r>
+        <w:t>────────────────────────────────────────</w:t>
       </w:r>
     </w:p>
     <w:p>
@@ -1583,131 +997,70 @@
     </w:p>
     <w:p>
       <w:r>
-        <w:rPr>
-          <w:rFonts w:ascii="Calibri" w:hAnsi="Calibri" w:eastAsia="Calibri"/>
-          <w:b w:val="0"/>
-          <w:i w:val="0"/>
-          <w:sz w:val="22"/>
-        </w:rPr>
         <w:t>Share screen on the GitHub repo or submission folder and walk:</w:t>
       </w:r>
     </w:p>
     <w:p>
       <w:r>
         <w:rPr>
-          <w:rFonts w:ascii="Consolas" w:hAnsi="Consolas" w:eastAsia="Consolas"/>
-          <w:b w:val="0"/>
-          <w:i w:val="0"/>
-          <w:color w:val="333333"/>
-          <w:sz w:val="20"/>
+          <w:rFonts w:ascii="Consolas" w:hAnsi="Consolas"/>
         </w:rPr>
         <w:t>E1_summary.json</w:t>
       </w:r>
       <w:r>
-        <w:rPr>
-          <w:rFonts w:ascii="Calibri" w:hAnsi="Calibri" w:eastAsia="Calibri"/>
-          <w:b w:val="0"/>
-          <w:i w:val="0"/>
-          <w:sz w:val="22"/>
-        </w:rPr>
         <w:t xml:space="preserve"> → </w:t>
       </w:r>
       <w:r>
         <w:rPr>
-          <w:rFonts w:ascii="Consolas" w:hAnsi="Consolas" w:eastAsia="Consolas"/>
-          <w:b w:val="0"/>
-          <w:i w:val="0"/>
-          <w:color w:val="333333"/>
-          <w:sz w:val="20"/>
+          <w:rFonts w:ascii="Consolas" w:hAnsi="Consolas"/>
         </w:rPr>
         <w:t>E2_summary.json</w:t>
       </w:r>
       <w:r>
-        <w:rPr>
-          <w:rFonts w:ascii="Calibri" w:hAnsi="Calibri" w:eastAsia="Calibri"/>
-          <w:b w:val="0"/>
-          <w:i w:val="0"/>
-          <w:sz w:val="22"/>
-        </w:rPr>
         <w:t xml:space="preserve"> → </w:t>
       </w:r>
       <w:r>
         <w:rPr>
-          <w:rFonts w:ascii="Consolas" w:hAnsi="Consolas" w:eastAsia="Consolas"/>
-          <w:b w:val="0"/>
-          <w:i w:val="0"/>
-          <w:color w:val="333333"/>
-          <w:sz w:val="20"/>
+          <w:rFonts w:ascii="Consolas" w:hAnsi="Consolas"/>
         </w:rPr>
         <w:t>E3_summary.json</w:t>
       </w:r>
       <w:r>
-        <w:rPr>
-          <w:rFonts w:ascii="Calibri" w:hAnsi="Calibri" w:eastAsia="Calibri"/>
-          <w:b w:val="0"/>
-          <w:i w:val="0"/>
-          <w:sz w:val="22"/>
-        </w:rPr>
         <w:t xml:space="preserve"> → </w:t>
       </w:r>
       <w:r>
         <w:rPr>
-          <w:rFonts w:ascii="Consolas" w:hAnsi="Consolas" w:eastAsia="Consolas"/>
-          <w:b w:val="0"/>
-          <w:i w:val="0"/>
-          <w:color w:val="333333"/>
-          <w:sz w:val="20"/>
+          <w:rFonts w:ascii="Consolas" w:hAnsi="Consolas"/>
         </w:rPr>
         <w:t>E4_summary.json</w:t>
       </w:r>
       <w:r>
-        <w:rPr>
-          <w:rFonts w:ascii="Calibri" w:hAnsi="Calibri" w:eastAsia="Calibri"/>
-          <w:b w:val="0"/>
-          <w:i w:val="0"/>
-          <w:sz w:val="22"/>
-        </w:rPr>
         <w:t xml:space="preserve"> → </w:t>
       </w:r>
       <w:r>
         <w:rPr>
-          <w:rFonts w:ascii="Consolas" w:hAnsi="Consolas" w:eastAsia="Consolas"/>
-          <w:b w:val="0"/>
-          <w:i w:val="0"/>
-          <w:color w:val="333333"/>
-          <w:sz w:val="20"/>
+          <w:rFonts w:ascii="Consolas" w:hAnsi="Consolas"/>
         </w:rPr>
         <w:t>E5_tool_invocations.csv</w:t>
       </w:r>
       <w:r>
-        <w:rPr>
-          <w:rFonts w:ascii="Calibri" w:hAnsi="Calibri" w:eastAsia="Calibri"/>
-          <w:b w:val="0"/>
-          <w:i w:val="0"/>
-          <w:sz w:val="22"/>
-        </w:rPr>
         <w:t xml:space="preserve"> → </w:t>
       </w:r>
       <w:r>
         <w:rPr>
-          <w:rFonts w:ascii="Consolas" w:hAnsi="Consolas" w:eastAsia="Consolas"/>
-          <w:b w:val="0"/>
-          <w:i w:val="0"/>
-          <w:color w:val="333333"/>
-          <w:sz w:val="20"/>
+          <w:rFonts w:ascii="Consolas" w:hAnsi="Consolas"/>
         </w:rPr>
         <w:t>E6_failure_analysis.csv</w:t>
       </w:r>
     </w:p>
     <w:p>
       <w:r>
-        <w:rPr>
-          <w:rFonts w:ascii="Calibri" w:hAnsi="Calibri" w:eastAsia="Calibri"/>
-          <w:b w:val="0"/>
-          <w:i w:val="0"/>
-          <w:sz w:val="22"/>
-        </w:rPr>
         <w:t>That still shows experiments and results using committed evidence.</w:t>
+      </w:r>
+    </w:p>
+    <w:p>
+      <w:r>
+        <w:t>────────────────────────────────────────</w:t>
       </w:r>
     </w:p>
     <w:p>
@@ -1723,13 +1076,7 @@
         <w:pStyle w:val="ListBullet"/>
       </w:pPr>
       <w:r>
-        <w:rPr>
-          <w:rFonts w:ascii="Calibri" w:hAnsi="Calibri" w:eastAsia="Calibri"/>
-          <w:b w:val="0"/>
-          <w:i w:val="0"/>
-          <w:sz w:val="22"/>
-        </w:rPr>
-        <w:t>☐ Failing E1 raw output / validator rejection</w:t>
+        <w:t>[ ] Failing E1 raw output / validator rejection</w:t>
       </w:r>
     </w:p>
     <w:p>
@@ -1737,13 +1084,7 @@
         <w:pStyle w:val="ListBullet"/>
       </w:pPr>
       <w:r>
-        <w:rPr>
-          <w:rFonts w:ascii="Calibri" w:hAnsi="Calibri" w:eastAsia="Calibri"/>
-          <w:b w:val="0"/>
-          <w:i w:val="0"/>
-          <w:sz w:val="22"/>
-        </w:rPr>
-        <w:t>☐ E2 comparison numbers</w:t>
+        <w:t>[ ] E2 comparison numbers</w:t>
       </w:r>
     </w:p>
     <w:p>
@@ -1751,13 +1092,7 @@
         <w:pStyle w:val="ListBullet"/>
       </w:pPr>
       <w:r>
-        <w:rPr>
-          <w:rFonts w:ascii="Calibri" w:hAnsi="Calibri" w:eastAsia="Calibri"/>
-          <w:b w:val="0"/>
-          <w:i w:val="0"/>
-          <w:sz w:val="22"/>
-        </w:rPr>
-        <w:t>☐ E3 decoding table</w:t>
+        <w:t>[ ] E3 decoding table</w:t>
       </w:r>
     </w:p>
     <w:p>
@@ -1765,21 +1100,11 @@
         <w:pStyle w:val="ListBullet"/>
       </w:pPr>
       <w:r>
-        <w:rPr>
-          <w:rFonts w:ascii="Calibri" w:hAnsi="Calibri" w:eastAsia="Calibri"/>
-          <w:b w:val="0"/>
-          <w:i w:val="0"/>
-          <w:sz w:val="22"/>
-        </w:rPr>
-        <w:t xml:space="preserve">☐ Schema + tool success </w:t>
+        <w:t xml:space="preserve">[ ] Schema + tool success </w:t>
       </w:r>
       <w:r>
         <w:rPr>
-          <w:rFonts w:ascii="Consolas" w:hAnsi="Consolas" w:eastAsia="Consolas"/>
-          <w:b w:val="0"/>
-          <w:i w:val="0"/>
-          <w:color w:val="333333"/>
-          <w:sz w:val="20"/>
+          <w:rFonts w:ascii="Consolas" w:hAnsi="Consolas"/>
         </w:rPr>
         <w:t>TXN-DEMO-001</w:t>
       </w:r>
@@ -1789,13 +1114,7 @@
         <w:pStyle w:val="ListBullet"/>
       </w:pPr>
       <w:r>
-        <w:rPr>
-          <w:rFonts w:ascii="Calibri" w:hAnsi="Calibri" w:eastAsia="Calibri"/>
-          <w:b w:val="0"/>
-          <w:i w:val="0"/>
-          <w:sz w:val="22"/>
-        </w:rPr>
-        <w:t>☐ Tool rejection on bad ID</w:t>
+        <w:t>[ ] Tool rejection on bad ID</w:t>
       </w:r>
     </w:p>
     <w:p>
@@ -1803,13 +1122,7 @@
         <w:pStyle w:val="ListBullet"/>
       </w:pPr>
       <w:r>
-        <w:rPr>
-          <w:rFonts w:ascii="Calibri" w:hAnsi="Calibri" w:eastAsia="Calibri"/>
-          <w:b w:val="0"/>
-          <w:i w:val="0"/>
-          <w:sz w:val="22"/>
-        </w:rPr>
-        <w:t>☐ Four metrics stated separately</w:t>
+        <w:t>[ ] Four metrics stated separately</w:t>
       </w:r>
     </w:p>
     <w:p>
@@ -1817,18 +1130,12 @@
         <w:pStyle w:val="ListBullet"/>
       </w:pPr>
       <w:r>
-        <w:rPr>
-          <w:rFonts w:ascii="Calibri" w:hAnsi="Calibri" w:eastAsia="Calibri"/>
-          <w:b w:val="0"/>
-          <w:i w:val="0"/>
-          <w:sz w:val="22"/>
-        </w:rPr>
-        <w:t>☐ Say: simulation / no real bank credentials</w:t>
+        <w:t>[ ] Say: simulation / no real bank credentials</w:t>
       </w:r>
     </w:p>
     <w:sectPr>
       <w:pgSz w:w="12240" w:h="15840"/>
-      <w:pgMar w:top="1440" w:right="1440" w:bottom="1440" w:left="1440" w:header="720" w:footer="720" w:gutter="0"/>
+      <w:pgMar w:top="1440" w:right="1800" w:bottom="1440" w:left="1800" w:header="720" w:footer="720" w:gutter="0"/>
       <w:cols w:space="720"/>
       <w:docGrid w:linePitch="360"/>
     </w:sectPr>
@@ -2199,6 +1506,10 @@
     <w:name w:val="Normal"/>
     <w:qFormat/>
     <w:rsid w:val="00FC693F"/>
+    <w:rPr>
+      <w:rFonts w:ascii="Calibri" w:hAnsi="Calibri"/>
+      <w:sz w:val="22"/>
+    </w:rPr>
   </w:style>
   <w:style w:type="paragraph" w:styleId="Header">
     <w:name w:val="header"/>

</xml_diff>

<commit_message>
Add clickable doc indexes and markdown file links across the repo.
Co-authored-by: Cursor <cursoragent@cursor.com>
</commit_message>
<xml_diff>
--- a/demo/HOW_TO_PRESENT_DEMO.docx
+++ b/demo/HOW_TO_PRESENT_DEMO.docx
@@ -40,13 +40,16 @@
         <w:t>Speaking lines:</w:t>
       </w:r>
       <w:r>
-        <w:t xml:space="preserve"> </w:t>
+        <w:t xml:space="preserve"> [</w:t>
       </w:r>
       <w:r>
         <w:rPr>
           <w:rFonts w:ascii="Consolas" w:hAnsi="Consolas"/>
         </w:rPr>
         <w:t>Group15_Demo_Speaking_Script.docx</w:t>
+      </w:r>
+      <w:r>
+        <w:t>](Group15_Demo_Speaking_Script.docx)</w:t>
       </w:r>
     </w:p>
     <w:p>
@@ -57,7 +60,7 @@
         <w:t>Repo:</w:t>
       </w:r>
       <w:r>
-        <w:t xml:space="preserve"> https://github.com/bits-pgaiml-agai/pcam-zg516-a1-banking77</w:t>
+        <w:t xml:space="preserve"> [https://github.com/bits-pgaiml-agai/pcam-zg516-a1-banking77](https://github.com/bits-pgaiml-agai/pcam-zg516-a1-banking77)</w:t>
       </w:r>
     </w:p>
     <w:p>
@@ -68,12 +71,12 @@
         <w:t>Recorded video (Google Drive):</w:t>
       </w:r>
       <w:r>
-        <w:t xml:space="preserve"> https://drive.google.com/file/d/1Dohvy0xKWXzJqEOCO_tHSFkhXZA9JHUY/view?usp=drive_link</w:t>
+        <w:t xml:space="preserve"> [https://drive.google.com/file/d/1Dohvy0xKWXzJqEOCO_tHSFkhXZA9JHUY/view?usp=drive_link](https://drive.google.com/file/d/1Dohvy0xKWXzJqEOCO_tHSFkhXZA9JHUY/view?usp=drive_link)</w:t>
       </w:r>
     </w:p>
     <w:p>
       <w:r>
-        <w:t xml:space="preserve">(also in </w:t>
+        <w:t>(also in [</w:t>
       </w:r>
       <w:r>
         <w:rPr>
@@ -82,7 +85,7 @@
         <w:t>demo/VIDEO_LINK.txt</w:t>
       </w:r>
       <w:r>
-        <w:t>)</w:t>
+        <w:t>](VIDEO_LINK.txt))</w:t>
       </w:r>
     </w:p>
     <w:p>
@@ -281,7 +284,7 @@
         <w:t>RUN_TEAM_EXPERIMENTS=True</w:t>
       </w:r>
       <w:r>
-        <w:t xml:space="preserve"> during the live demo (full E2–E5 regen takes too long). Show those results from </w:t>
+        <w:t xml:space="preserve"> during the live demo (full E2–E5 regen takes too long). Show those results from [</w:t>
       </w:r>
       <w:r>
         <w:rPr>
@@ -290,7 +293,7 @@
         <w:t>evidence/</w:t>
       </w:r>
       <w:r>
-        <w:t>.</w:t>
+        <w:t>](../evidence/).</w:t>
       </w:r>
     </w:p>
     <w:p>
@@ -311,7 +314,7 @@
         <w:pStyle w:val="ListNumber"/>
       </w:pPr>
       <w:r>
-        <w:t>Open repo: https://github.com/bits-pgaiml-agai/pcam-zg516-a1-banking77</w:t>
+        <w:t>Open repo: [https://github.com/bits-pgaiml-agai/pcam-zg516-a1-banking77](https://github.com/bits-pgaiml-agai/pcam-zg516-a1-banking77)</w:t>
       </w:r>
     </w:p>
     <w:p>
@@ -319,7 +322,7 @@
         <w:pStyle w:val="ListNumber"/>
       </w:pPr>
       <w:r>
-        <w:t xml:space="preserve">Upload </w:t>
+        <w:t>Upload [</w:t>
       </w:r>
       <w:r>
         <w:rPr>
@@ -328,7 +331,7 @@
         <w:t>notebooks/BANKING77_GenAI_Assistant.ipynb</w:t>
       </w:r>
       <w:r>
-        <w:t xml:space="preserve"> to Google Colab</w:t>
+        <w:t>](../notebooks/BANKING77_GenAI_Assistant.ipynb) to Google Colab</w:t>
       </w:r>
     </w:p>
     <w:p>
@@ -393,10 +396,16 @@
         <w:pStyle w:val="ListBullet"/>
       </w:pPr>
       <w:r>
+        <w:t>[</w:t>
+      </w:r>
+      <w:r>
         <w:rPr>
           <w:rFonts w:ascii="Consolas" w:hAnsi="Consolas"/>
         </w:rPr>
         <w:t>evidence/baseline/</w:t>
+      </w:r>
+      <w:r>
+        <w:t>](../evidence/baseline/)</w:t>
       </w:r>
     </w:p>
     <w:p>
@@ -404,10 +413,16 @@
         <w:pStyle w:val="ListBullet"/>
       </w:pPr>
       <w:r>
+        <w:t>[</w:t>
+      </w:r>
+      <w:r>
         <w:rPr>
           <w:rFonts w:ascii="Consolas" w:hAnsi="Consolas"/>
         </w:rPr>
         <w:t>evidence/prompts_decoding/</w:t>
+      </w:r>
+      <w:r>
+        <w:t>](../evidence/prompts_decoding/)</w:t>
       </w:r>
     </w:p>
     <w:p>
@@ -415,10 +430,16 @@
         <w:pStyle w:val="ListBullet"/>
       </w:pPr>
       <w:r>
+        <w:t>[</w:t>
+      </w:r>
+      <w:r>
         <w:rPr>
           <w:rFonts w:ascii="Consolas" w:hAnsi="Consolas"/>
         </w:rPr>
         <w:t>evidence/structured_tools/</w:t>
+      </w:r>
+      <w:r>
+        <w:t>](../evidence/structured_tools/)</w:t>
       </w:r>
     </w:p>
     <w:p>
@@ -426,10 +447,16 @@
         <w:pStyle w:val="ListBullet"/>
       </w:pPr>
       <w:r>
+        <w:t>[</w:t>
+      </w:r>
+      <w:r>
         <w:rPr>
           <w:rFonts w:ascii="Consolas" w:hAnsi="Consolas"/>
         </w:rPr>
         <w:t>evidence/evaluation/</w:t>
+      </w:r>
+      <w:r>
+        <w:t>](../evidence/evaluation/)</w:t>
       </w:r>
     </w:p>
     <w:p>
@@ -437,13 +464,16 @@
         <w:pStyle w:val="ListNumber"/>
       </w:pPr>
       <w:r>
-        <w:t xml:space="preserve">Rehearse from </w:t>
+        <w:t>Rehearse from [</w:t>
       </w:r>
       <w:r>
         <w:rPr>
           <w:rFonts w:ascii="Consolas" w:hAnsi="Consolas"/>
         </w:rPr>
         <w:t>Group15_Demo_Speaking_Script.docx</w:t>
+      </w:r>
+      <w:r>
+        <w:t>](Group15_Demo_Speaking_Script.docx)</w:t>
       </w:r>
     </w:p>
     <w:p>
@@ -551,7 +581,7 @@
         <w:pStyle w:val="ListBullet"/>
       </w:pPr>
       <w:r>
-        <w:t xml:space="preserve">File: </w:t>
+        <w:t>File: [</w:t>
       </w:r>
       <w:r>
         <w:rPr>
@@ -560,7 +590,7 @@
         <w:t>evidence/baseline/E1_summary.json</w:t>
       </w:r>
       <w:r>
-        <w:t xml:space="preserve"> → </w:t>
+        <w:t xml:space="preserve">](../evidence/baseline/E1_summary.json) → </w:t>
       </w:r>
       <w:r>
         <w:rPr>
@@ -574,7 +604,7 @@
         <w:pStyle w:val="ListBullet"/>
       </w:pPr>
       <w:r>
-        <w:t xml:space="preserve">File: one bad line in </w:t>
+        <w:t>File: one bad line in [</w:t>
       </w:r>
       <w:r>
         <w:rPr>
@@ -583,7 +613,7 @@
         <w:t>E1_baseline_outputs.jsonl</w:t>
       </w:r>
       <w:r>
-        <w:t xml:space="preserve"> (Markdown / invented label / card ask)</w:t>
+        <w:t>](../evidence/baseline/E1_baseline_outputs.jsonl) (Markdown / invented label / card ask)</w:t>
       </w:r>
     </w:p>
     <w:p>
@@ -604,19 +634,25 @@
         <w:pStyle w:val="ListNumber"/>
       </w:pPr>
       <w:r>
+        <w:t>[</w:t>
+      </w:r>
+      <w:r>
         <w:rPr>
           <w:rFonts w:ascii="Consolas" w:hAnsi="Consolas"/>
         </w:rPr>
         <w:t>evidence/prompts_decoding/E2_prompt_comparison.csv</w:t>
       </w:r>
       <w:r>
-        <w:t xml:space="preserve"> or </w:t>
+        <w:t>](../evidence/prompts_decoding/E2_prompt_comparison.csv) or [</w:t>
       </w:r>
       <w:r>
         <w:rPr>
           <w:rFonts w:ascii="Consolas" w:hAnsi="Consolas"/>
         </w:rPr>
         <w:t>E2_summary.json</w:t>
+      </w:r>
+      <w:r>
+        <w:t>](../evidence/prompts_decoding/E2_summary.json)</w:t>
       </w:r>
     </w:p>
     <w:p>
@@ -656,7 +692,7 @@
         <w:pStyle w:val="ListNumber"/>
       </w:pPr>
       <w:r>
-        <w:t xml:space="preserve">Optional: </w:t>
+        <w:t>Optional: [</w:t>
       </w:r>
       <w:r>
         <w:rPr>
@@ -665,7 +701,7 @@
         <w:t>prompts/ACTUAL_PROMPTS_E2.md</w:t>
       </w:r>
       <w:r>
-        <w:t xml:space="preserve"> or one </w:t>
+        <w:t xml:space="preserve">](../prompts/ACTUAL_PROMPTS_E2.md) or one </w:t>
       </w:r>
       <w:r>
         <w:rPr>
@@ -682,19 +718,25 @@
         <w:pStyle w:val="ListNumber"/>
       </w:pPr>
       <w:r>
+        <w:t>[</w:t>
+      </w:r>
+      <w:r>
         <w:rPr>
           <w:rFonts w:ascii="Consolas" w:hAnsi="Consolas"/>
         </w:rPr>
         <w:t>E3_decoding_summary.csv</w:t>
       </w:r>
       <w:r>
-        <w:t xml:space="preserve"> / </w:t>
+        <w:t>](../evidence/prompts_decoding/E3_decoding_summary.csv) / [</w:t>
       </w:r>
       <w:r>
         <w:rPr>
           <w:rFonts w:ascii="Consolas" w:hAnsi="Consolas"/>
         </w:rPr>
         <w:t>E3_summary.json</w:t>
+      </w:r>
+      <w:r>
+        <w:t>](../evidence/prompts_decoding/E3_summary.json)</w:t>
       </w:r>
     </w:p>
     <w:p>
@@ -719,7 +761,7 @@
         <w:pStyle w:val="ListNumber"/>
       </w:pPr>
       <w:r>
-        <w:t xml:space="preserve">Optional one line: </w:t>
+        <w:t>Optional one line: [</w:t>
       </w:r>
       <w:r>
         <w:rPr>
@@ -728,7 +770,7 @@
         <w:t>docs/MODEL_COMPARISON_OLLAMA.md</w:t>
       </w:r>
       <w:r>
-        <w:t xml:space="preserve"> (3b stronger; we standardize on 1.5b-instruct)</w:t>
+        <w:t>](../docs/MODEL_COMPARISON_OLLAMA.md) (3b stronger; we standardize on 1.5b-instruct)</w:t>
       </w:r>
     </w:p>
     <w:p>
@@ -744,13 +786,16 @@
         <w:pStyle w:val="ListNumber"/>
       </w:pPr>
       <w:r>
+        <w:t>[</w:t>
+      </w:r>
+      <w:r>
         <w:rPr>
           <w:rFonts w:ascii="Consolas" w:hAnsi="Consolas"/>
         </w:rPr>
         <w:t>schemas/response.schema.json</w:t>
       </w:r>
       <w:r>
-        <w:t xml:space="preserve"> — five keys</w:t>
+        <w:t>](../schemas/response.schema.json) — five keys</w:t>
       </w:r>
     </w:p>
     <w:p>
@@ -758,13 +803,16 @@
         <w:pStyle w:val="ListNumber"/>
       </w:pPr>
       <w:r>
+        <w:t>[</w:t>
+      </w:r>
+      <w:r>
         <w:rPr>
           <w:rFonts w:ascii="Consolas" w:hAnsi="Consolas"/>
         </w:rPr>
         <w:t>evidence/structured_tools/E4_summary.json</w:t>
       </w:r>
       <w:r>
-        <w:t xml:space="preserve"> — </w:t>
+        <w:t xml:space="preserve">](../evidence/structured_tools/E4_summary.json) — </w:t>
       </w:r>
       <w:r>
         <w:rPr>
@@ -803,7 +851,7 @@
         <w:pStyle w:val="ListNumber"/>
       </w:pPr>
       <w:r>
-        <w:t xml:space="preserve">Optional: </w:t>
+        <w:t>Optional: [</w:t>
       </w:r>
       <w:r>
         <w:rPr>
@@ -812,7 +860,7 @@
         <w:t>E5_integrated_tool_demo.json</w:t>
       </w:r>
       <w:r>
-        <w:t xml:space="preserve"> — invalid LLM JSON blocked the tool</w:t>
+        <w:t>](../evidence/structured_tools/E5_integrated_tool_demo.json) — invalid LLM JSON blocked the tool</w:t>
       </w:r>
     </w:p>
     <w:p>
@@ -836,13 +884,16 @@
         <w:pStyle w:val="ListNumber"/>
       </w:pPr>
       <w:r>
+        <w:t>[</w:t>
+      </w:r>
+      <w:r>
         <w:rPr>
           <w:rFonts w:ascii="Consolas" w:hAnsi="Consolas"/>
         </w:rPr>
         <w:t>evidence/evaluation/E6_failure_analysis.csv</w:t>
       </w:r>
       <w:r>
-        <w:t xml:space="preserve"> — F1, F2, F3</w:t>
+        <w:t>](../evidence/evaluation/E6_failure_analysis.csv) — F1, F2, F3</w:t>
       </w:r>
     </w:p>
     <w:p>
@@ -858,10 +909,16 @@
         <w:pStyle w:val="ListNumber"/>
       </w:pPr>
       <w:r>
+        <w:t>[</w:t>
+      </w:r>
+      <w:r>
         <w:rPr>
           <w:rFonts w:ascii="Consolas" w:hAnsi="Consolas"/>
         </w:rPr>
         <w:t>evidence/evaluation/E7_integration_checklist.md</w:t>
+      </w:r>
+      <w:r>
+        <w:t>](../evidence/evaluation/E7_integration_checklist.md)</w:t>
       </w:r>
     </w:p>
     <w:p>
@@ -1002,13 +1059,16 @@
     </w:p>
     <w:p>
       <w:r>
+        <w:t>[</w:t>
+      </w:r>
+      <w:r>
         <w:rPr>
           <w:rFonts w:ascii="Consolas" w:hAnsi="Consolas"/>
         </w:rPr>
         <w:t>E1_summary.json</w:t>
       </w:r>
       <w:r>
-        <w:t xml:space="preserve"> → </w:t>
+        <w:t>](../evidence/baseline/E1_summary.json) → [</w:t>
       </w:r>
       <w:r>
         <w:rPr>
@@ -1017,7 +1077,7 @@
         <w:t>E2_summary.json</w:t>
       </w:r>
       <w:r>
-        <w:t xml:space="preserve"> → </w:t>
+        <w:t>](../evidence/prompts_decoding/E2_summary.json) → [</w:t>
       </w:r>
       <w:r>
         <w:rPr>
@@ -1026,7 +1086,7 @@
         <w:t>E3_summary.json</w:t>
       </w:r>
       <w:r>
-        <w:t xml:space="preserve"> → </w:t>
+        <w:t>](../evidence/prompts_decoding/E3_summary.json) → [</w:t>
       </w:r>
       <w:r>
         <w:rPr>
@@ -1035,7 +1095,7 @@
         <w:t>E4_summary.json</w:t>
       </w:r>
       <w:r>
-        <w:t xml:space="preserve"> → </w:t>
+        <w:t>](../evidence/structured_tools/E4_summary.json) → [</w:t>
       </w:r>
       <w:r>
         <w:rPr>
@@ -1044,13 +1104,16 @@
         <w:t>E5_tool_invocations.csv</w:t>
       </w:r>
       <w:r>
-        <w:t xml:space="preserve"> → </w:t>
+        <w:t>](../evidence/structured_tools/E5_tool_invocations.csv) → [</w:t>
       </w:r>
       <w:r>
         <w:rPr>
           <w:rFonts w:ascii="Consolas" w:hAnsi="Consolas"/>
         </w:rPr>
         <w:t>E6_failure_analysis.csv</w:t>
+      </w:r>
+      <w:r>
+        <w:t>](../evidence/evaluation/E6_failure_analysis.csv)</w:t>
       </w:r>
     </w:p>
     <w:p>

</xml_diff>